<commit_message>
small update .gitignore with maven target, intellij settings, and OS files
</commit_message>
<xml_diff>
--- a/Test_Payment_Transaction_API_v_0_1.docx
+++ b/Test_Payment_Transaction_API_v_0_1.docx
@@ -1,6 +1,6 @@
 
 <file path=word/document.xml><?xml version="1.0" encoding="utf-8"?>
-<w:document xmlns:wpc="http://schemas.microsoft.com/office/word/2010/wordprocessingCanvas" xmlns:cx="http://schemas.microsoft.com/office/drawing/2014/chartex" xmlns:cx1="http://schemas.microsoft.com/office/drawing/2015/9/8/chartex" xmlns:cx2="http://schemas.microsoft.com/office/drawing/2015/10/21/chartex" xmlns:cx3="http://schemas.microsoft.com/office/drawing/2016/5/9/chartex" xmlns:cx4="http://schemas.microsoft.com/office/drawing/2016/5/10/chartex" xmlns:cx5="http://schemas.microsoft.com/office/drawing/2016/5/11/chartex" xmlns:cx6="http://schemas.microsoft.com/office/drawing/2016/5/12/chartex" xmlns:cx7="http://schemas.microsoft.com/office/drawing/2016/5/13/chartex" xmlns:cx8="http://schemas.microsoft.com/office/drawing/2016/5/14/chartex" xmlns:mc="http://schemas.openxmlformats.org/markup-compatibility/2006" xmlns:aink="http://schemas.microsoft.com/office/drawing/2016/ink" xmlns:am3d="http://schemas.microsoft.com/office/drawing/2017/model3d" xmlns:o="urn:schemas-microsoft-com:office:office" xmlns:oel="http://schemas.microsoft.com/office/2019/extlst" xmlns:r="http://schemas.openxmlformats.org/officeDocument/2006/relationships" xmlns:m="http://schemas.openxmlformats.org/officeDocument/2006/math" xmlns:v="urn:schemas-microsoft-com:vml" xmlns:wp14="http://schemas.microsoft.com/office/word/2010/wordprocessingDrawing" xmlns:wp="http://schemas.openxmlformats.org/drawingml/2006/wordprocessingDrawing" xmlns:w10="urn:schemas-microsoft-com:office:word" xmlns:w="http://schemas.openxmlformats.org/wordprocessingml/2006/main" xmlns:w14="http://schemas.microsoft.com/office/word/2010/wordml" xmlns:w15="http://schemas.microsoft.com/office/word/2012/wordml" xmlns:w16cex="http://schemas.microsoft.com/office/word/2018/wordml/cex" xmlns:w16cid="http://schemas.microsoft.com/office/word/2016/wordml/cid" xmlns:w16="http://schemas.microsoft.com/office/word/2018/wordml" xmlns:w16sdtdh="http://schemas.microsoft.com/office/word/2020/wordml/sdtdatahash" xmlns:w16se="http://schemas.microsoft.com/office/word/2015/wordml/symex" xmlns:wpg="http://schemas.microsoft.com/office/word/2010/wordprocessingGroup" xmlns:wpi="http://schemas.microsoft.com/office/word/2010/wordprocessingInk" xmlns:wne="http://schemas.microsoft.com/office/word/2006/wordml" xmlns:wps="http://schemas.microsoft.com/office/word/2010/wordprocessingShape" mc:Ignorable="w14 w15 w16se w16cid w16 w16cex w16sdtdh wp14">
+<w:document xmlns:wpc="http://schemas.microsoft.com/office/word/2010/wordprocessingCanvas" xmlns:cx="http://schemas.microsoft.com/office/drawing/2014/chartex" xmlns:cx1="http://schemas.microsoft.com/office/drawing/2015/9/8/chartex" xmlns:cx2="http://schemas.microsoft.com/office/drawing/2015/10/21/chartex" xmlns:cx3="http://schemas.microsoft.com/office/drawing/2016/5/9/chartex" xmlns:cx4="http://schemas.microsoft.com/office/drawing/2016/5/10/chartex" xmlns:cx5="http://schemas.microsoft.com/office/drawing/2016/5/11/chartex" xmlns:cx6="http://schemas.microsoft.com/office/drawing/2016/5/12/chartex" xmlns:cx7="http://schemas.microsoft.com/office/drawing/2016/5/13/chartex" xmlns:cx8="http://schemas.microsoft.com/office/drawing/2016/5/14/chartex" xmlns:mc="http://schemas.openxmlformats.org/markup-compatibility/2006" xmlns:aink="http://schemas.microsoft.com/office/drawing/2016/ink" xmlns:am3d="http://schemas.microsoft.com/office/drawing/2017/model3d" xmlns:o="urn:schemas-microsoft-com:office:office" xmlns:oel="http://schemas.microsoft.com/office/2019/extlst" xmlns:r="http://schemas.openxmlformats.org/officeDocument/2006/relationships" xmlns:m="http://schemas.openxmlformats.org/officeDocument/2006/math" xmlns:v="urn:schemas-microsoft-com:vml" xmlns:wp14="http://schemas.microsoft.com/office/word/2010/wordprocessingDrawing" xmlns:wp="http://schemas.openxmlformats.org/drawingml/2006/wordprocessingDrawing" xmlns:w10="urn:schemas-microsoft-com:office:word" xmlns:w="http://schemas.openxmlformats.org/wordprocessingml/2006/main" xmlns:w14="http://schemas.microsoft.com/office/word/2010/wordml" xmlns:w15="http://schemas.microsoft.com/office/word/2012/wordml" xmlns:w16cex="http://schemas.microsoft.com/office/word/2018/wordml/cex" xmlns:w16cid="http://schemas.microsoft.com/office/word/2016/wordml/cid" xmlns:w16="http://schemas.microsoft.com/office/word/2018/wordml" xmlns:w16du="http://schemas.microsoft.com/office/word/2023/wordml/word16du" xmlns:w16sdtdh="http://schemas.microsoft.com/office/word/2020/wordml/sdtdatahash" xmlns:w16sdtfl="http://schemas.microsoft.com/office/word/2024/wordml/sdtformatlock" xmlns:w16se="http://schemas.microsoft.com/office/word/2015/wordml/symex" xmlns:wpg="http://schemas.microsoft.com/office/word/2010/wordprocessingGroup" xmlns:wpi="http://schemas.microsoft.com/office/word/2010/wordprocessingInk" xmlns:wne="http://schemas.microsoft.com/office/word/2006/wordml" xmlns:wps="http://schemas.microsoft.com/office/word/2010/wordprocessingShape" mc:Ignorable="w14 w15 w16se w16cid w16 w16cex w16sdtdh w16sdtfl w16du wp14">
   <w:body>
     <w:p>
       <w:pPr>
@@ -695,7 +695,15 @@
                                         <w:sz w:val="18"/>
                                         <w:szCs w:val="18"/>
                                       </w:rPr>
-                                      <w:t>Aneline.gyuviyska@gmail.com</w:t>
+                                      <w:t>a</w:t>
+                                    </w:r>
+                                    <w:r>
+                                      <w:rPr>
+                                        <w:color w:val="595959" w:themeColor="text1" w:themeTint="A6"/>
+                                        <w:sz w:val="18"/>
+                                        <w:szCs w:val="18"/>
+                                      </w:rPr>
+                                      <w:t>neline.gyuviyska@gmail.com</w:t>
                                     </w:r>
                                   </w:sdtContent>
                                 </w:sdt>
@@ -794,7 +802,15 @@
                                   <w:sz w:val="18"/>
                                   <w:szCs w:val="18"/>
                                 </w:rPr>
-                                <w:t>Aneline.gyuviyska@gmail.com</w:t>
+                                <w:t>a</w:t>
+                              </w:r>
+                              <w:r>
+                                <w:rPr>
+                                  <w:color w:val="595959" w:themeColor="text1" w:themeTint="A6"/>
+                                  <w:sz w:val="18"/>
+                                  <w:szCs w:val="18"/>
+                                </w:rPr>
+                                <w:t>neline.gyuviyska@gmail.com</w:t>
                               </w:r>
                             </w:sdtContent>
                           </w:sdt>
@@ -5277,7 +5293,7 @@
 </file>
 
 <file path=word/numbering.xml><?xml version="1.0" encoding="utf-8"?>
-<w:numbering xmlns:wpc="http://schemas.microsoft.com/office/word/2010/wordprocessingCanvas" xmlns:cx="http://schemas.microsoft.com/office/drawing/2014/chartex" xmlns:cx1="http://schemas.microsoft.com/office/drawing/2015/9/8/chartex" xmlns:cx2="http://schemas.microsoft.com/office/drawing/2015/10/21/chartex" xmlns:cx3="http://schemas.microsoft.com/office/drawing/2016/5/9/chartex" xmlns:cx4="http://schemas.microsoft.com/office/drawing/2016/5/10/chartex" xmlns:cx5="http://schemas.microsoft.com/office/drawing/2016/5/11/chartex" xmlns:cx6="http://schemas.microsoft.com/office/drawing/2016/5/12/chartex" xmlns:cx7="http://schemas.microsoft.com/office/drawing/2016/5/13/chartex" xmlns:cx8="http://schemas.microsoft.com/office/drawing/2016/5/14/chartex" xmlns:mc="http://schemas.openxmlformats.org/markup-compatibility/2006" xmlns:aink="http://schemas.microsoft.com/office/drawing/2016/ink" xmlns:am3d="http://schemas.microsoft.com/office/drawing/2017/model3d" xmlns:o="urn:schemas-microsoft-com:office:office" xmlns:oel="http://schemas.microsoft.com/office/2019/extlst" xmlns:r="http://schemas.openxmlformats.org/officeDocument/2006/relationships" xmlns:m="http://schemas.openxmlformats.org/officeDocument/2006/math" xmlns:v="urn:schemas-microsoft-com:vml" xmlns:wp14="http://schemas.microsoft.com/office/word/2010/wordprocessingDrawing" xmlns:wp="http://schemas.openxmlformats.org/drawingml/2006/wordprocessingDrawing" xmlns:w10="urn:schemas-microsoft-com:office:word" xmlns:w="http://schemas.openxmlformats.org/wordprocessingml/2006/main" xmlns:w14="http://schemas.microsoft.com/office/word/2010/wordml" xmlns:w15="http://schemas.microsoft.com/office/word/2012/wordml" xmlns:w16cex="http://schemas.microsoft.com/office/word/2018/wordml/cex" xmlns:w16cid="http://schemas.microsoft.com/office/word/2016/wordml/cid" xmlns:w16="http://schemas.microsoft.com/office/word/2018/wordml" xmlns:w16sdtdh="http://schemas.microsoft.com/office/word/2020/wordml/sdtdatahash" xmlns:w16se="http://schemas.microsoft.com/office/word/2015/wordml/symex" xmlns:wpg="http://schemas.microsoft.com/office/word/2010/wordprocessingGroup" xmlns:wpi="http://schemas.microsoft.com/office/word/2010/wordprocessingInk" xmlns:wne="http://schemas.microsoft.com/office/word/2006/wordml" xmlns:wps="http://schemas.microsoft.com/office/word/2010/wordprocessingShape" mc:Ignorable="w14 w15 w16se w16cid w16 w16cex w16sdtdh wp14">
+<w:numbering xmlns:wpc="http://schemas.microsoft.com/office/word/2010/wordprocessingCanvas" xmlns:cx="http://schemas.microsoft.com/office/drawing/2014/chartex" xmlns:cx1="http://schemas.microsoft.com/office/drawing/2015/9/8/chartex" xmlns:cx2="http://schemas.microsoft.com/office/drawing/2015/10/21/chartex" xmlns:cx3="http://schemas.microsoft.com/office/drawing/2016/5/9/chartex" xmlns:cx4="http://schemas.microsoft.com/office/drawing/2016/5/10/chartex" xmlns:cx5="http://schemas.microsoft.com/office/drawing/2016/5/11/chartex" xmlns:cx6="http://schemas.microsoft.com/office/drawing/2016/5/12/chartex" xmlns:cx7="http://schemas.microsoft.com/office/drawing/2016/5/13/chartex" xmlns:cx8="http://schemas.microsoft.com/office/drawing/2016/5/14/chartex" xmlns:mc="http://schemas.openxmlformats.org/markup-compatibility/2006" xmlns:aink="http://schemas.microsoft.com/office/drawing/2016/ink" xmlns:am3d="http://schemas.microsoft.com/office/drawing/2017/model3d" xmlns:o="urn:schemas-microsoft-com:office:office" xmlns:oel="http://schemas.microsoft.com/office/2019/extlst" xmlns:r="http://schemas.openxmlformats.org/officeDocument/2006/relationships" xmlns:m="http://schemas.openxmlformats.org/officeDocument/2006/math" xmlns:v="urn:schemas-microsoft-com:vml" xmlns:wp14="http://schemas.microsoft.com/office/word/2010/wordprocessingDrawing" xmlns:wp="http://schemas.openxmlformats.org/drawingml/2006/wordprocessingDrawing" xmlns:w10="urn:schemas-microsoft-com:office:word" xmlns:w="http://schemas.openxmlformats.org/wordprocessingml/2006/main" xmlns:w14="http://schemas.microsoft.com/office/word/2010/wordml" xmlns:w15="http://schemas.microsoft.com/office/word/2012/wordml" xmlns:w16cex="http://schemas.microsoft.com/office/word/2018/wordml/cex" xmlns:w16cid="http://schemas.microsoft.com/office/word/2016/wordml/cid" xmlns:w16="http://schemas.microsoft.com/office/word/2018/wordml" xmlns:w16du="http://schemas.microsoft.com/office/word/2023/wordml/word16du" xmlns:w16sdtdh="http://schemas.microsoft.com/office/word/2020/wordml/sdtdatahash" xmlns:w16sdtfl="http://schemas.microsoft.com/office/word/2024/wordml/sdtformatlock" xmlns:w16se="http://schemas.microsoft.com/office/word/2015/wordml/symex" xmlns:wpg="http://schemas.microsoft.com/office/word/2010/wordprocessingGroup" xmlns:wpi="http://schemas.microsoft.com/office/word/2010/wordprocessingInk" xmlns:wne="http://schemas.microsoft.com/office/word/2006/wordml" xmlns:wps="http://schemas.microsoft.com/office/word/2010/wordprocessingShape" mc:Ignorable="w14 w15 w16se w16cid w16 w16cex w16sdtdh w16sdtfl w16du wp14">
   <w:abstractNum w:abstractNumId="0" w15:restartNumberingAfterBreak="0">
     <w:nsid w:val="04817868"/>
     <w:multiLevelType w:val="hybridMultilevel"/>
@@ -6752,7 +6768,7 @@
 </file>
 
 <file path=word/styles.xml><?xml version="1.0" encoding="utf-8"?>
-<w:styles xmlns:mc="http://schemas.openxmlformats.org/markup-compatibility/2006" xmlns:r="http://schemas.openxmlformats.org/officeDocument/2006/relationships" xmlns:w="http://schemas.openxmlformats.org/wordprocessingml/2006/main" xmlns:w14="http://schemas.microsoft.com/office/word/2010/wordml" xmlns:w15="http://schemas.microsoft.com/office/word/2012/wordml" xmlns:w16cex="http://schemas.microsoft.com/office/word/2018/wordml/cex" xmlns:w16cid="http://schemas.microsoft.com/office/word/2016/wordml/cid" xmlns:w16="http://schemas.microsoft.com/office/word/2018/wordml" xmlns:w16sdtdh="http://schemas.microsoft.com/office/word/2020/wordml/sdtdatahash" xmlns:w16se="http://schemas.microsoft.com/office/word/2015/wordml/symex" mc:Ignorable="w14 w15 w16se w16cid w16 w16cex w16sdtdh">
+<w:styles xmlns:mc="http://schemas.openxmlformats.org/markup-compatibility/2006" xmlns:r="http://schemas.openxmlformats.org/officeDocument/2006/relationships" xmlns:w="http://schemas.openxmlformats.org/wordprocessingml/2006/main" xmlns:w14="http://schemas.microsoft.com/office/word/2010/wordml" xmlns:w15="http://schemas.microsoft.com/office/word/2012/wordml" xmlns:w16cex="http://schemas.microsoft.com/office/word/2018/wordml/cex" xmlns:w16cid="http://schemas.microsoft.com/office/word/2016/wordml/cid" xmlns:w16="http://schemas.microsoft.com/office/word/2018/wordml" xmlns:w16du="http://schemas.microsoft.com/office/word/2023/wordml/word16du" xmlns:w16sdtdh="http://schemas.microsoft.com/office/word/2020/wordml/sdtdatahash" xmlns:w16sdtfl="http://schemas.microsoft.com/office/word/2024/wordml/sdtformatlock" xmlns:w16se="http://schemas.microsoft.com/office/word/2015/wordml/symex" mc:Ignorable="w14 w15 w16se w16cid w16 w16cex w16sdtdh w16sdtfl w16du">
   <w:docDefaults>
     <w:rPrDefault>
       <w:rPr>
@@ -7732,7 +7748,7 @@
   <CompanyAddress/>
   <CompanyPhone/>
   <CompanyFax/>
-  <CompanyEmail>Aneline.gyuviyska@gmail.com</CompanyEmail>
+  <CompanyEmail>aneline.gyuviyska@gmail.com</CompanyEmail>
 </CoverPageProperties>
 </file>
 

</xml_diff>